<commit_message>
Add/update spa data for UWTranslationNotes
</commit_message>
<xml_diff>
--- a/spa/docx/02.content.docx
+++ b/spa/docx/02.content.docx
@@ -5075,6 +5075,20 @@
         <w:rPr>
           <w:lang w:val="es_ES" w:bidi="es_ES"/>
         </w:rPr>
+      </w:r>
+    </w:p>
+    <w:p>
+      <w:pPr/>
+      <w:r>
+        <w:rPr>
+          <w:lang w:val="es_ES" w:bidi="es_ES"/>
+        </w:rPr>
+      </w:r>
+      <w:r>
+        <w:rPr>
+          <w:lang w:val="es_ES" w:bidi="es_ES"/>
+        </w:rPr>
+        <w:t>דַּבֵּר֮</w:t>
       </w:r>
     </w:p>
     <w:p>

</xml_diff>